<commit_message>
<create> version production document deliverables
</commit_message>
<xml_diff>
--- a/output/docx/第三章_暗礁忧鸣_统一标准版.docx
+++ b/output/docx/第三章_暗礁忧鸣_统一标准版.docx
@@ -1564,7 +1564,7 @@
         <w:pStyle w:val="Heading1"/>
         <w:keepNext/>
         <w:keepLines/>
-        <w:pageBreakBefore/>
+        <w:pageBreakBefore w:val="0"/>
         <w:spacing w:before="200" w:after="100" w:line="283" w:lineRule="auto"/>
       </w:pPr>
       <w:r>
@@ -2193,7 +2193,7 @@
           <w:color w:val="A02B93"/>
           <w:sz w:val="21"/>
         </w:rPr>
-        <w:t>内部证据包已保存。它可能帮助组织决定是否继续核实或向有权限的部门反映，但不自动证明违法，也不保证产生某个结果。</w:t>
+        <w:t>内部证据包已保存。它可能帮助组织决定是否继续核实或向有权限的部门反映。这份证据包不能证明违法，也不保证产生某个结果。</w:t>
       </w:r>
     </w:p>
     <w:p>
@@ -2540,7 +2540,7 @@
           <w:i w:val="0"/>
           <w:sz w:val="21"/>
         </w:rPr>
-        <w:t>玩家再次站在同一处公共岸线。码头设施比上次更完整，海面传来施工与船舶的声音。</w:t>
+        <w:t>玩家再次站在同一处公共岸线。码头设施已经成形，一艘船从远处经过。</w:t>
       </w:r>
     </w:p>
     <w:p>
@@ -2567,7 +2567,7 @@
           <w:color w:val="A02B93"/>
           <w:sz w:val="21"/>
         </w:rPr>
-        <w:t>泉州市海洋与渔业局2026年3月的公开信息仍将11号、12号泊位工程称为在建海洋工程，并记载了现场检查与水下作业环保指导。工程继续建设不等于争议已经解决，也不能反向证明此前所有质疑成立或不成立。</w:t>
+        <w:t>泉州市海洋与渔业局2026年3月的公开信息将11号、12号泊位工程称为在建海洋工程；南安市人力资源和社会保障局2026年5月的工资专户销户公示则称该工程已竣工。两项信息对应不同时间和行政事项，均不能说明生态争议已经得到实体裁判。</w:t>
       </w:r>
     </w:p>
     <w:p>
@@ -2906,6 +2906,7 @@
     </w:p>
     <w:p>
       <w:pPr>
+        <w:keepNext/>
         <w:keepLines w:val="0"/>
         <w:pageBreakBefore w:val="0"/>
         <w:spacing w:before="0" w:after="20" w:line="283" w:lineRule="auto"/>
@@ -2932,7 +2933,7 @@
     </w:p>
     <w:p>
       <w:pPr>
-        <w:keepLines w:val="0"/>
+        <w:keepLines/>
         <w:pageBreakBefore w:val="0"/>
         <w:spacing w:before="0" w:after="100" w:line="283" w:lineRule="auto"/>
       </w:pPr>
@@ -2949,6 +2950,7 @@
     </w:p>
     <w:p>
       <w:pPr>
+        <w:keepNext/>
         <w:keepLines w:val="0"/>
         <w:pageBreakBefore w:val="0"/>
         <w:spacing w:before="0" w:after="20" w:line="283" w:lineRule="auto"/>
@@ -2975,7 +2977,7 @@
     </w:p>
     <w:p>
       <w:pPr>
-        <w:keepLines w:val="0"/>
+        <w:keepLines/>
         <w:pageBreakBefore w:val="0"/>
         <w:spacing w:before="0" w:after="100" w:line="283" w:lineRule="auto"/>
       </w:pPr>
@@ -2992,6 +2994,7 @@
     </w:p>
     <w:p>
       <w:pPr>
+        <w:keepNext/>
         <w:keepLines w:val="0"/>
         <w:pageBreakBefore w:val="0"/>
         <w:spacing w:before="0" w:after="20" w:line="283" w:lineRule="auto"/>
@@ -3018,7 +3021,7 @@
     </w:p>
     <w:p>
       <w:pPr>
-        <w:keepLines w:val="0"/>
+        <w:keepLines/>
         <w:pageBreakBefore w:val="0"/>
         <w:spacing w:before="0" w:after="100" w:line="283" w:lineRule="auto"/>
       </w:pPr>
@@ -3035,6 +3038,7 @@
     </w:p>
     <w:p>
       <w:pPr>
+        <w:keepNext/>
         <w:keepLines w:val="0"/>
         <w:pageBreakBefore w:val="0"/>
         <w:spacing w:before="0" w:after="20" w:line="283" w:lineRule="auto"/>
@@ -3061,7 +3065,7 @@
     </w:p>
     <w:p>
       <w:pPr>
-        <w:keepLines w:val="0"/>
+        <w:keepLines/>
         <w:pageBreakBefore w:val="0"/>
         <w:spacing w:before="0" w:after="100" w:line="283" w:lineRule="auto"/>
       </w:pPr>
@@ -3078,6 +3082,7 @@
     </w:p>
     <w:p>
       <w:pPr>
+        <w:keepNext/>
         <w:keepLines w:val="0"/>
         <w:pageBreakBefore w:val="0"/>
         <w:spacing w:before="0" w:after="20" w:line="283" w:lineRule="auto"/>
@@ -3104,7 +3109,7 @@
     </w:p>
     <w:p>
       <w:pPr>
-        <w:keepLines w:val="0"/>
+        <w:keepLines/>
         <w:pageBreakBefore w:val="0"/>
         <w:spacing w:before="0" w:after="100" w:line="283" w:lineRule="auto"/>
       </w:pPr>
@@ -3121,6 +3126,7 @@
     </w:p>
     <w:p>
       <w:pPr>
+        <w:keepNext/>
         <w:keepLines w:val="0"/>
         <w:pageBreakBefore w:val="0"/>
         <w:spacing w:before="0" w:after="20" w:line="283" w:lineRule="auto"/>
@@ -3147,7 +3153,7 @@
     </w:p>
     <w:p>
       <w:pPr>
-        <w:keepLines w:val="0"/>
+        <w:keepLines/>
         <w:pageBreakBefore w:val="0"/>
         <w:spacing w:before="0" w:after="100" w:line="283" w:lineRule="auto"/>
       </w:pPr>
@@ -3164,6 +3170,7 @@
     </w:p>
     <w:p>
       <w:pPr>
+        <w:keepNext/>
         <w:keepLines w:val="0"/>
         <w:pageBreakBefore w:val="0"/>
         <w:spacing w:before="0" w:after="20" w:line="283" w:lineRule="auto"/>
@@ -3190,7 +3197,7 @@
     </w:p>
     <w:p>
       <w:pPr>
-        <w:keepLines w:val="0"/>
+        <w:keepLines/>
         <w:pageBreakBefore w:val="0"/>
         <w:spacing w:before="0" w:after="100" w:line="283" w:lineRule="auto"/>
       </w:pPr>
@@ -3207,6 +3214,7 @@
     </w:p>
     <w:p>
       <w:pPr>
+        <w:keepNext/>
         <w:keepLines w:val="0"/>
         <w:pageBreakBefore w:val="0"/>
         <w:spacing w:before="0" w:after="20" w:line="283" w:lineRule="auto"/>
@@ -3233,7 +3241,7 @@
     </w:p>
     <w:p>
       <w:pPr>
-        <w:keepLines w:val="0"/>
+        <w:keepLines/>
         <w:pageBreakBefore w:val="0"/>
         <w:spacing w:before="0" w:after="100" w:line="283" w:lineRule="auto"/>
       </w:pPr>
@@ -3250,6 +3258,7 @@
     </w:p>
     <w:p>
       <w:pPr>
+        <w:keepNext/>
         <w:keepLines w:val="0"/>
         <w:pageBreakBefore w:val="0"/>
         <w:spacing w:before="0" w:after="20" w:line="283" w:lineRule="auto"/>
@@ -3276,7 +3285,7 @@
     </w:p>
     <w:p>
       <w:pPr>
-        <w:keepLines w:val="0"/>
+        <w:keepLines/>
         <w:pageBreakBefore w:val="0"/>
         <w:spacing w:before="0" w:after="100" w:line="283" w:lineRule="auto"/>
       </w:pPr>
@@ -3293,6 +3302,51 @@
     </w:p>
     <w:p>
       <w:pPr>
+        <w:keepNext/>
+        <w:keepLines w:val="0"/>
+        <w:pageBreakBefore w:val="0"/>
+        <w:spacing w:before="0" w:after="20" w:line="283" w:lineRule="auto"/>
+      </w:pPr>
+      <w:r>
+        <w:rPr>
+          <w:rFonts w:ascii="Aptos" w:hAnsi="Aptos" w:eastAsia="Microsoft YaHei" w:cs="Aptos"/>
+          <w:b/>
+          <w:i w:val="0"/>
+          <w:sz w:val="21"/>
+        </w:rPr>
+        <w:t xml:space="preserve">南安市人力资源和社会保障局 泊位项目工资专户销户公示  </w:t>
+      </w:r>
+      <w:hyperlink r:id="rId19">
+        <w:r>
+          <w:rPr>
+            <w:rFonts w:ascii="Aptos" w:hAnsi="Aptos" w:eastAsia="Microsoft YaHei"/>
+            <w:color w:val="A02B93"/>
+            <w:u w:val="single"/>
+          </w:rPr>
+          <w:t>https://www.nanan.gov.cn/zwgk/xwzx/tzgg/202605/t20260522_3293824.htm</w:t>
+        </w:r>
+      </w:hyperlink>
+    </w:p>
+    <w:p>
+      <w:pPr>
+        <w:keepLines/>
+        <w:pageBreakBefore w:val="0"/>
+        <w:spacing w:before="0" w:after="100" w:line="283" w:lineRule="auto"/>
+      </w:pPr>
+      <w:r>
+        <w:rPr>
+          <w:rFonts w:ascii="Aptos" w:hAnsi="Aptos" w:eastAsia="Microsoft YaHei" w:cs="Aptos"/>
+          <w:b w:val="0"/>
+          <w:i w:val="0"/>
+          <w:color w:val="666666"/>
+          <w:sz w:val="19"/>
+        </w:rPr>
+        <w:t>2026年5月22日公开信息。公示称该工程已竣工并提交工资支付资料；该表述服务于工资专户销户，不等于生态争议已有裁判结论。</w:t>
+      </w:r>
+    </w:p>
+    <w:p>
+      <w:pPr>
+        <w:keepNext/>
         <w:keepLines w:val="0"/>
         <w:pageBreakBefore w:val="0"/>
         <w:spacing w:before="0" w:after="20" w:line="283" w:lineRule="auto"/>
@@ -3306,7 +3360,7 @@
         </w:rPr>
         <w:t xml:space="preserve">对话地球 社会组织为何无法以公益诉讼保护白海豚  </w:t>
       </w:r>
-      <w:hyperlink r:id="rId19">
+      <w:hyperlink r:id="rId20">
         <w:r>
           <w:rPr>
             <w:rFonts w:ascii="Aptos" w:hAnsi="Aptos" w:eastAsia="Microsoft YaHei"/>
@@ -3319,7 +3373,7 @@
     </w:p>
     <w:p>
       <w:pPr>
-        <w:keepLines w:val="0"/>
+        <w:keepLines/>
         <w:pageBreakBefore w:val="0"/>
         <w:spacing w:before="0" w:after="100" w:line="283" w:lineRule="auto"/>
       </w:pPr>
@@ -4177,9 +4231,6 @@
     <w:qFormat/>
     <w:rsid w:val="00FC693F"/>
     <w:pPr>
-      <w:pBdr>
-        <w:bottom w:val="single" w:sz="8" w:space="4" w:color="4F81BD" w:themeColor="accent1"/>
-      </w:pBdr>
       <w:spacing w:after="300" w:line="240" w:lineRule="auto"/>
       <w:contextualSpacing/>
     </w:pPr>

</xml_diff>